<commit_message>
Update resume files from Google Docs
</commit_message>
<xml_diff>
--- a/public/resume/Carlos_F_Revilla-Resume.docx
+++ b/public/resume/Carlos_F_Revilla-Resume.docx
@@ -464,7 +464,7 @@
           <w:szCs w:val="24"/>
           <w:rtl w:val="0"/>
         </w:rPr>
-        <w:t xml:space="preserve">Built a multi-tenant C#/.NET background service with Quartz.NET and Citus/RDS to aggregate patient device data, delivering critical insights to a client-facing dashboard.</w:t>
+        <w:t xml:space="preserve">Supported in maintenance, and deployments of Quartz.NET background service to preserve data quality for a client-facing dashboard synced with a Citus/RDS that aggregates patient device data.</w:t>
       </w:r>
     </w:p>
     <w:p>
@@ -1185,7 +1185,7 @@
           <w:szCs w:val="24"/>
           <w:rtl w:val="0"/>
         </w:rPr>
-        <w:t xml:space="preserve">Trained the DinoV2 model on a T4 GPU using Google Colab for 10 epochs, attaining train and validation loss values of 0.031 and 0.062, and achieving 99.9% model accuracy.</w:t>
+        <w:t xml:space="preserve">Trained the DinoV2 model using Google Colab for 10 epochs, achieving 99.9% model accuracy.</w:t>
       </w:r>
     </w:p>
     <w:p>

</xml_diff>